<commit_message>
Corregir enlaces de las referencias APA a las direcciones actuales de MongoDB
El blog de MongoDB se movió a /company/blog/ y dos artículos del
Developer Center ya no existen; se reemplazan por sus páginas
equivalentes del manual (Store polymorphic data y Reduce the number of
collections) y se reordenan las letras de las citas s. f.

Co-Authored-By: Claude Opus 5.5 <noreply@anthropic.com>
Claude-Session: https://claude.ai/code/session_01HYRJkRSYN6E1PmGnQP9Y6k
</commit_message>
<xml_diff>
--- a/Universidad/BASE DE DATOS/TRABAJO/Persona_3.4.3_y_4.2.2/Secciones_3.4.3_y_4.2.2.docx
+++ b/Universidad/BASE DE DATOS/TRABAJO/Persona_3.4.3_y_4.2.2/Secciones_3.4.3_y_4.2.2.docx
@@ -809,7 +809,7 @@
           <w:b w:val="0"/>
           <w:i w:val="0"/>
         </w:rPr>
-        <w:t xml:space="preserve"> Consiste en guardar los datos relacionados dentro del mismo documento, como subdocumentos o arreglos, cuando la relación es 1:1 o 1:pocos y la información se consulta en conjunto. Así, una sola lectura recupera toda la información y cualquier escritura sobre el documento es atómica (MongoDB, Inc., s. f.-a).</w:t>
+        <w:t xml:space="preserve"> Consiste en guardar los datos relacionados dentro del mismo documento, como subdocumentos o arreglos, cuando la relación es 1:1 o 1:pocos y la información se consulta en conjunto. Así, una sola lectura recupera toda la información y cualquier escritura sobre el documento es atómica (MongoDB, Inc., s. f.-b).</w:t>
       </w:r>
     </w:p>
     <w:p>
@@ -1217,7 +1217,7 @@
           <w:b w:val="0"/>
           <w:i w:val="0"/>
         </w:rPr>
-        <w:t xml:space="preserve"> Se guarda únicamente el identificador (_id) del documento relacionado, de forma similar a una clave foránea. Se usa cuando la relación es 1:muchos sin límite, cuando el documento relacionado se comparte entre muchos otros o cuando se actualiza de forma independiente (MongoDB, Inc., s. f.-a).</w:t>
+        <w:t xml:space="preserve"> Se guarda únicamente el identificador (_id) del documento relacionado, de forma similar a una clave foránea. Se usa cuando la relación es 1:muchos sin límite, cuando el documento relacionado se comparte entre muchos otros o cuando se actualiza de forma independiente (MongoDB, Inc., s. f.-b).</w:t>
       </w:r>
     </w:p>
     <w:p>
@@ -1246,7 +1246,7 @@
           <w:b w:val="0"/>
           <w:i w:val="0"/>
         </w:rPr>
-        <w:t xml:space="preserve"> referencian a la instalación. Una instalación acumula miles de registros de este tipo cada mes; si se embebieran, el documento crecería sin límite y superaría el tamaño máximo de 16 MB por documento (MongoDB, Inc., s. f.-c), lo que comprometería el requisito RNF-4.</w:t>
+        <w:t xml:space="preserve"> referencian a la instalación. Una instalación acumula miles de registros de este tipo cada mes; si se embebieran, el documento crecería sin límite y superaría el tamaño máximo de 16 MB por documento (MongoDB, Inc., s. f.-d), lo que comprometería el requisito RNF-4.</w:t>
       </w:r>
     </w:p>
     <w:p>
@@ -1795,7 +1795,7 @@
           <w:b w:val="0"/>
           <w:i w:val="0"/>
         </w:rPr>
-        <w:t xml:space="preserve"> (time series collections), que aplican internamente este mismo principio de agrupación por cubetas (MongoDB, Inc., s. f.-e).</w:t>
+        <w:t xml:space="preserve"> (time series collections), que aplican internamente este mismo principio de agrupación por cubetas (MongoDB, Inc., s. f.-a).</w:t>
       </w:r>
     </w:p>
     <w:p>
@@ -2859,7 +2859,7 @@
           <w:b w:val="0"/>
           <w:i w:val="0"/>
         </w:rPr>
-        <w:t xml:space="preserve"> Permite que los documentos de una misma colección tengan estructuras distintas según su tipo, siempre que compartan los campos principales (Alger y Coupal, 2022). Es una de las ventajas del esquema flexible de MongoDB.</w:t>
+        <w:t xml:space="preserve"> Permite que los documentos de una misma colección tengan estructuras distintas según su tipo, siempre que compartan los campos principales (MongoDB, Inc., s. f.-g). Es una de las ventajas del esquema flexible de MongoDB.</w:t>
       </w:r>
     </w:p>
     <w:p>
@@ -3036,7 +3036,7 @@
           <w:b w:val="0"/>
           <w:i w:val="0"/>
         </w:rPr>
-        <w:t>MongoDB también documenta antipatrones de diseño, es decir, prácticas que degradan el rendimiento, como los arreglos sin límite o la creación de un número excesivo de colecciones (MongoDB, Inc., s. f.-d; Schaefer y Coupal, 2020). La Tabla 3 resume cómo el modelo de SolarPulse IoT los evita.</w:t>
+        <w:t>MongoDB también documenta antipatrones de diseño, es decir, prácticas que degradan el rendimiento, como los arreglos sin límite o la creación de un número excesivo de colecciones (MongoDB, Inc., s. f.-e, s. f.-f). La Tabla 3 resume cómo el modelo de SolarPulse IoT los evita.</w:t>
       </w:r>
     </w:p>
     <w:p>
@@ -3357,7 +3357,7 @@
           <w:i w:val="0"/>
           <w:sz w:val="20"/>
         </w:rPr>
-        <w:t>Elaboración propia con base en MongoDB, Inc. (s. f.-d) y Schaefer y Coupal (2020).</w:t>
+        <w:t>Elaboración propia con base en MongoDB, Inc. (s. f.-e, s. f.-f).</w:t>
       </w:r>
     </w:p>
     <w:p>
@@ -8524,7 +8524,7 @@
           <w:i w:val="0"/>
           <w:sz w:val="20"/>
         </w:rPr>
-        <w:t>Elaboración propia con base en MongoDB, Inc. (s. f.-b).</w:t>
+        <w:t>Elaboración propia con base en MongoDB, Inc. (s. f.-c).</w:t>
       </w:r>
     </w:p>
     <w:p>
@@ -8566,33 +8566,6 @@
           <w:b w:val="0"/>
           <w:i w:val="0"/>
         </w:rPr>
-        <w:t xml:space="preserve">Alger, K. W. y Coupal, D. (2022, 11 de enero). </w:t>
-      </w:r>
-      <w:r>
-        <w:rPr>
-          <w:b w:val="0"/>
-          <w:i/>
-        </w:rPr>
-        <w:t>Building with patterns: The polymorphic pattern</w:t>
-      </w:r>
-      <w:r>
-        <w:rPr>
-          <w:b w:val="0"/>
-          <w:i w:val="0"/>
-        </w:rPr>
-        <w:t>. MongoDB Developer Center. https://www.mongodb.com/developer/how-to/polymorphic-pattern/</w:t>
-      </w:r>
-    </w:p>
-    <w:p>
-      <w:pPr>
-        <w:spacing w:after="120"/>
-        <w:ind w:left="720" w:hanging="720"/>
-      </w:pPr>
-      <w:r>
-        <w:rPr>
-          <w:b w:val="0"/>
-          <w:i w:val="0"/>
-        </w:rPr>
         <w:t xml:space="preserve">Coupal, D. y Alger, K. W. (2019a, 31 de enero). Building with patterns: The bucket pattern. </w:t>
       </w:r>
       <w:r>
@@ -8607,7 +8580,7 @@
           <w:b w:val="0"/>
           <w:i w:val="0"/>
         </w:rPr>
-        <w:t>. https://www.mongodb.com/blog/building-with-patterns-the-bucket-pattern</w:t>
+        <w:t>. https://www.mongodb.com/company/blog/building-with-patterns-the-bucket-pattern</w:t>
       </w:r>
     </w:p>
     <w:p>
@@ -8661,7 +8634,7 @@
           <w:b w:val="0"/>
           <w:i w:val="0"/>
         </w:rPr>
-        <w:t>. https://www.mongodb.com/blog/post/building-with-patterns-the-subset-pattern</w:t>
+        <w:t>. https://www.mongodb.com/company/blog/building-with-patterns-the-subset-pattern</w:t>
       </w:r>
     </w:p>
     <w:p>
@@ -8688,7 +8661,7 @@
           <w:b w:val="0"/>
           <w:i w:val="0"/>
         </w:rPr>
-        <w:t>. https://www.mongodb.com/blog/post/building-with-patterns-the-extended-reference-pattern</w:t>
+        <w:t>. https://www.mongodb.com/company/blog/building-with-patterns-the-extended-reference-pattern</w:t>
       </w:r>
     </w:p>
     <w:p>
@@ -8715,7 +8688,7 @@
           <w:b w:val="0"/>
           <w:i w:val="0"/>
         </w:rPr>
-        <w:t>. https://www.mongodb.com/blog/post/building-with-patterns-a-summary</w:t>
+        <w:t>. https://www.mongodb.com/company/blog/building-with-patterns-a-summary</w:t>
       </w:r>
     </w:p>
     <w:p>
@@ -8762,14 +8735,14 @@
           <w:b w:val="0"/>
           <w:i/>
         </w:rPr>
-        <w:t>Embedded data versus references</w:t>
+        <w:t>About time series data</w:t>
       </w:r>
       <w:r>
         <w:rPr>
           <w:b w:val="0"/>
           <w:i w:val="0"/>
         </w:rPr>
-        <w:t>. MongoDB Manual. Recuperado el 1 de noviembre de 2026, de https://www.mongodb.com/docs/manual/data-modeling/concepts/embedding-vs-references/</w:t>
+        <w:t>. MongoDB Database Manual. Recuperado el 1 de noviembre de 2026, de https://www.mongodb.com/docs/manual/core/timeseries/timeseries-bucketing/</w:t>
       </w:r>
     </w:p>
     <w:p>
@@ -8789,14 +8762,14 @@
           <w:b w:val="0"/>
           <w:i/>
         </w:rPr>
-        <w:t>Model monetary data</w:t>
+        <w:t>Best practices for data modeling</w:t>
       </w:r>
       <w:r>
         <w:rPr>
           <w:b w:val="0"/>
           <w:i w:val="0"/>
         </w:rPr>
-        <w:t>. MongoDB Manual. Recuperado el 1 de noviembre de 2026, de https://www.mongodb.com/docs/manual/tutorial/model-monetary-data/</w:t>
+        <w:t>. MongoDB Database Manual. Recuperado el 1 de noviembre de 2026, de https://www.mongodb.com/docs/manual/data-modeling/concepts/embedding-vs-references/</w:t>
       </w:r>
     </w:p>
     <w:p>
@@ -8816,14 +8789,14 @@
           <w:b w:val="0"/>
           <w:i/>
         </w:rPr>
-        <w:t>MongoDB limits and thresholds</w:t>
+        <w:t>Model monetary data</w:t>
       </w:r>
       <w:r>
         <w:rPr>
           <w:b w:val="0"/>
           <w:i w:val="0"/>
         </w:rPr>
-        <w:t>. MongoDB Manual. Recuperado el 1 de noviembre de 2026, de https://www.mongodb.com/docs/manual/reference/limits/</w:t>
+        <w:t>. MongoDB Database Manual. Recuperado el 1 de noviembre de 2026, de https://www.mongodb.com/docs/manual/tutorial/model-monetary-data/</w:t>
       </w:r>
     </w:p>
     <w:p>
@@ -8843,14 +8816,14 @@
           <w:b w:val="0"/>
           <w:i/>
         </w:rPr>
-        <w:t>Schema design anti-patterns</w:t>
+        <w:t>MongoDB limits and thresholds</w:t>
       </w:r>
       <w:r>
         <w:rPr>
           <w:b w:val="0"/>
           <w:i w:val="0"/>
         </w:rPr>
-        <w:t>. MongoDB Manual. Recuperado el 1 de noviembre de 2026, de https://www.mongodb.com/docs/manual/data-modeling/design-antipatterns/</w:t>
+        <w:t>. MongoDB Database Manual. Recuperado el 1 de noviembre de 2026, de https://www.mongodb.com/docs/manual/reference/limits/</w:t>
       </w:r>
     </w:p>
     <w:p>
@@ -8870,14 +8843,14 @@
           <w:b w:val="0"/>
           <w:i/>
         </w:rPr>
-        <w:t>Time series collections</w:t>
+        <w:t>Reduce the number of collections</w:t>
       </w:r>
       <w:r>
         <w:rPr>
           <w:b w:val="0"/>
           <w:i w:val="0"/>
         </w:rPr>
-        <w:t>. MongoDB Manual. Recuperado el 1 de noviembre de 2026, de https://www.mongodb.com/docs/manual/core/timeseries-collections/</w:t>
+        <w:t>. MongoDB Database Manual. Recuperado el 1 de noviembre de 2026, de https://www.mongodb.com/docs/manual/data-modeling/design-antipatterns/reduce-collections/</w:t>
       </w:r>
     </w:p>
     <w:p>
@@ -8890,21 +8863,48 @@
           <w:b w:val="0"/>
           <w:i w:val="0"/>
         </w:rPr>
-        <w:t xml:space="preserve">Schaefer, L. y Coupal, D. (2020, 13 de mayo). </w:t>
+        <w:t xml:space="preserve">MongoDB, Inc. (s. f.-f). </w:t>
       </w:r>
       <w:r>
         <w:rPr>
           <w:b w:val="0"/>
           <w:i/>
         </w:rPr>
-        <w:t>Massive number of collections</w:t>
+        <w:t>Schema design anti-patterns</w:t>
       </w:r>
       <w:r>
         <w:rPr>
           <w:b w:val="0"/>
           <w:i w:val="0"/>
         </w:rPr>
-        <w:t>. MongoDB Developer Center. https://www.mongodb.com/developer/products/mongodb/schema-design-anti-pattern-massive-number-collections/</w:t>
+        <w:t>. MongoDB Database Manual. Recuperado el 1 de noviembre de 2026, de https://www.mongodb.com/docs/manual/data-modeling/design-antipatterns/</w:t>
+      </w:r>
+    </w:p>
+    <w:p>
+      <w:pPr>
+        <w:spacing w:after="120"/>
+        <w:ind w:left="720" w:hanging="720"/>
+      </w:pPr>
+      <w:r>
+        <w:rPr>
+          <w:b w:val="0"/>
+          <w:i w:val="0"/>
+        </w:rPr>
+        <w:t xml:space="preserve">MongoDB, Inc. (s. f.-g). </w:t>
+      </w:r>
+      <w:r>
+        <w:rPr>
+          <w:b w:val="0"/>
+          <w:i/>
+        </w:rPr>
+        <w:t>Store polymorphic data</w:t>
+      </w:r>
+      <w:r>
+        <w:rPr>
+          <w:b w:val="0"/>
+          <w:i w:val="0"/>
+        </w:rPr>
+        <w:t>. MongoDB Database Manual. Recuperado el 1 de noviembre de 2026, de https://www.mongodb.com/docs/manual/data-modeling/design-patterns/polymorphic-data/polymorphic-schema-pattern/</w:t>
       </w:r>
     </w:p>
     <w:sectPr>

</xml_diff>

<commit_message>
Citar la página del manual de MongoDB para el patrón Bucket
Reemplaza el artículo del blog por "Group data with the bucket pattern"
del manual oficial y reordena las letras de las citas.

Co-Authored-By: Claude Opus 5.5 <noreply@anthropic.com>
Claude-Session: https://claude.ai/code/session_01HYRJkRSYN6E1PmGnQP9Y6k
</commit_message>
<xml_diff>
--- a/Universidad/BASE DE DATOS/TRABAJO/Persona_3.4.3_y_4.2.2/Secciones_3.4.3_y_4.2.2.docx
+++ b/Universidad/BASE DE DATOS/TRABAJO/Persona_3.4.3_y_4.2.2/Secciones_3.4.3_y_4.2.2.docx
@@ -33,7 +33,7 @@
           <w:b w:val="0"/>
           <w:i w:val="0"/>
         </w:rPr>
-        <w:t xml:space="preserve"> de la aplicación: qué datos se leen juntos, con qué frecuencia se consultan o actualizan y cuánto crecen con el tiempo (Coupal et al., 2023; Coupal y Alger, 2019e). Para SolarPulse IoT se tomaron como base las historias de usuario (US-01 a US-15) y los requisitos no funcionales del Capítulo II, en especial la validación de permisos en menos de 1.5 segundos (RNF-1), la ingesta continua de más de 1,000 lecturas por segundo (RNF-3), el crecimiento anual del 100 % del histórico de telemetría (RNF-4), la entrega de métricas agregadas en menos de 3 segundos (RNF-5) y la trazabilidad entre anomalías, alertas, incidencias y mantenimientos (RNF-9 y RNF-10).</w:t>
+        <w:t xml:space="preserve"> de la aplicación: qué datos se leen juntos, con qué frecuencia se consultan o actualizan y cuánto crecen con el tiempo (Coupal et al., 2023; Coupal y Alger, 2019d). Para SolarPulse IoT se tomaron como base las historias de usuario (US-01 a US-15) y los requisitos no funcionales del Capítulo II, en especial la validación de permisos en menos de 1.5 segundos (RNF-1), la ingesta continua de más de 1,000 lecturas por segundo (RNF-3), el crecimiento anual del 100 % del histórico de telemetría (RNF-4), la entrega de métricas agregadas en menos de 3 segundos (RNF-5) y la trazabilidad entre anomalías, alertas, incidencias y mantenimientos (RNF-9 y RNF-10).</w:t>
       </w:r>
     </w:p>
     <w:p>
@@ -45,7 +45,7 @@
           <w:b w:val="0"/>
           <w:i w:val="0"/>
         </w:rPr>
-        <w:t>Con estos criterios se aplicaron siete de los patrones de diseño documental descritos por Coupal y Alger (2019e), que se resumen en la Tabla 1 y se explican a continuación. Como resultado, las 25 tablas del diagrama físico normalizado (sección 4.2.1) se organizan en 14 colecciones.</w:t>
+        <w:t>Con estos criterios se aplicaron siete de los patrones de diseño documental descritos por Coupal y Alger (2019d), que se resumen en la Tabla 1 y se explican a continuación. Como resultado, las 25 tablas del diagrama físico normalizado (sección 4.2.1) se organizan en 14 colecciones.</w:t>
       </w:r>
     </w:p>
     <w:p>
@@ -782,7 +782,7 @@
           <w:i w:val="0"/>
           <w:sz w:val="20"/>
         </w:rPr>
-        <w:t>Elaboración propia con base en Coupal y Alger (2019e).</w:t>
+        <w:t>Elaboración propia con base en Coupal y Alger (2019d).</w:t>
       </w:r>
     </w:p>
     <w:p>
@@ -1246,7 +1246,7 @@
           <w:b w:val="0"/>
           <w:i w:val="0"/>
         </w:rPr>
-        <w:t xml:space="preserve"> referencian a la instalación. Una instalación acumula miles de registros de este tipo cada mes; si se embebieran, el documento crecería sin límite y superaría el tamaño máximo de 16 MB por documento (MongoDB, Inc., s. f.-d), lo que comprometería el requisito RNF-4.</w:t>
+        <w:t xml:space="preserve"> referencian a la instalación. Una instalación acumula miles de registros de este tipo cada mes; si se embebieran, el documento crecería sin límite y superaría el tamaño máximo de 16 MB por documento (MongoDB, Inc., s. f.-e), lo que comprometería el requisito RNF-4.</w:t>
       </w:r>
     </w:p>
     <w:p>
@@ -1445,7 +1445,7 @@
           <w:b w:val="0"/>
           <w:i w:val="0"/>
         </w:rPr>
-        <w:t xml:space="preserve"> Agrupa varios registros de una serie de tiempo en un solo documento que representa un intervalo (una "cubeta"). En lugar de un documento por registro, se crea un documento por origen y por periodo, lo que reduce drásticamente la cantidad de documentos y el tamaño de los índices (Coupal y Alger, 2019a).</w:t>
+        <w:t xml:space="preserve"> Agrupa varios registros de una serie de tiempo en un solo documento que representa un intervalo (una "cubeta"). En lugar de un documento por registro, se crea un documento por origen y por periodo, lo que reduce drásticamente la cantidad de documentos y el tamaño de los índices (MongoDB, Inc., s. f.-c).</w:t>
       </w:r>
     </w:p>
     <w:p>
@@ -1822,7 +1822,7 @@
           <w:b w:val="0"/>
           <w:i w:val="0"/>
         </w:rPr>
-        <w:t xml:space="preserve"> Los valores derivados se calculan una sola vez, al momento de escribir, y se guardan en el documento, en lugar de recalcularlos en cada consulta. Es conveniente cuando las lecturas son mucho más frecuentes que las escrituras (Coupal y Alger, 2019b).</w:t>
+        <w:t xml:space="preserve"> Los valores derivados se calculan una sola vez, al momento de escribir, y se guardan en el documento, en lugar de recalcularlos en cada consulta. Es conveniente cuando las lecturas son mucho más frecuentes que las escrituras (Coupal y Alger, 2019a).</w:t>
       </w:r>
     </w:p>
     <w:p>
@@ -1952,7 +1952,7 @@
           <w:b w:val="0"/>
           <w:i w:val="0"/>
         </w:rPr>
-        <w:t xml:space="preserve"> Además del _id del documento relacionado, se copian los pocos campos de ese documento que más se muestran en pantalla. Así se evita realizar un $lookup (equivalente a un JOIN) en las consultas frecuentes. Solo se copian campos estables, que casi nunca cambian (Coupal y Alger, 2019d).</w:t>
+        <w:t xml:space="preserve"> Además del _id del documento relacionado, se copian los pocos campos de ese documento que más se muestran en pantalla. Así se evita realizar un $lookup (equivalente a un JOIN) en las consultas frecuentes. Solo se copian campos estables, que casi nunca cambian (Coupal y Alger, 2019c).</w:t>
       </w:r>
     </w:p>
     <w:p>
@@ -2714,7 +2714,7 @@
           <w:b w:val="0"/>
           <w:i w:val="0"/>
         </w:rPr>
-        <w:t xml:space="preserve"> El documento principal guarda solo una parte de los datos relacionados, la más consultada, mientras que el conjunto completo se mantiene en su propia colección. Así el documento principal se mantiene pequeño y rápido de leer (Coupal y Alger, 2019c).</w:t>
+        <w:t xml:space="preserve"> El documento principal guarda solo una parte de los datos relacionados, la más consultada, mientras que el conjunto completo se mantiene en su propia colección. Así el documento principal se mantiene pequeño y rápido de leer (Coupal y Alger, 2019b).</w:t>
       </w:r>
     </w:p>
     <w:p>
@@ -2859,7 +2859,7 @@
           <w:b w:val="0"/>
           <w:i w:val="0"/>
         </w:rPr>
-        <w:t xml:space="preserve"> Permite que los documentos de una misma colección tengan estructuras distintas según su tipo, siempre que compartan los campos principales (MongoDB, Inc., s. f.-g). Es una de las ventajas del esquema flexible de MongoDB.</w:t>
+        <w:t xml:space="preserve"> Permite que los documentos de una misma colección tengan estructuras distintas según su tipo, siempre que compartan los campos principales (MongoDB, Inc., s. f.-h). Es una de las ventajas del esquema flexible de MongoDB.</w:t>
       </w:r>
     </w:p>
     <w:p>
@@ -3036,7 +3036,7 @@
           <w:b w:val="0"/>
           <w:i w:val="0"/>
         </w:rPr>
-        <w:t>MongoDB también documenta antipatrones de diseño, es decir, prácticas que degradan el rendimiento, como los arreglos sin límite o la creación de un número excesivo de colecciones (MongoDB, Inc., s. f.-e, s. f.-f). La Tabla 3 resume cómo el modelo de SolarPulse IoT los evita.</w:t>
+        <w:t>MongoDB también documenta antipatrones de diseño, es decir, prácticas que degradan el rendimiento, como los arreglos sin límite o la creación de un número excesivo de colecciones (MongoDB, Inc., s. f.-f, s. f.-g). La Tabla 3 resume cómo el modelo de SolarPulse IoT los evita.</w:t>
       </w:r>
     </w:p>
     <w:p>
@@ -3357,7 +3357,7 @@
           <w:i w:val="0"/>
           <w:sz w:val="20"/>
         </w:rPr>
-        <w:t>Elaboración propia con base en MongoDB, Inc. (s. f.-e, s. f.-f).</w:t>
+        <w:t>Elaboración propia con base en MongoDB, Inc. (s. f.-f, s. f.-g).</w:t>
       </w:r>
     </w:p>
     <w:p>
@@ -8524,7 +8524,7 @@
           <w:i w:val="0"/>
           <w:sz w:val="20"/>
         </w:rPr>
-        <w:t>Elaboración propia con base en MongoDB, Inc. (s. f.-c).</w:t>
+        <w:t>Elaboración propia con base en MongoDB, Inc. (s. f.-d).</w:t>
       </w:r>
     </w:p>
     <w:p>
@@ -8566,34 +8566,7 @@
           <w:b w:val="0"/>
           <w:i w:val="0"/>
         </w:rPr>
-        <w:t xml:space="preserve">Coupal, D. y Alger, K. W. (2019a, 31 de enero). Building with patterns: The bucket pattern. </w:t>
-      </w:r>
-      <w:r>
-        <w:rPr>
-          <w:b w:val="0"/>
-          <w:i/>
-        </w:rPr>
-        <w:t>MongoDB Blog</w:t>
-      </w:r>
-      <w:r>
-        <w:rPr>
-          <w:b w:val="0"/>
-          <w:i w:val="0"/>
-        </w:rPr>
-        <w:t>. https://www.mongodb.com/company/blog/building-with-patterns-the-bucket-pattern</w:t>
-      </w:r>
-    </w:p>
-    <w:p>
-      <w:pPr>
-        <w:spacing w:after="120"/>
-        <w:ind w:left="720" w:hanging="720"/>
-      </w:pPr>
-      <w:r>
-        <w:rPr>
-          <w:b w:val="0"/>
-          <w:i w:val="0"/>
-        </w:rPr>
-        <w:t xml:space="preserve">Coupal, D. y Alger, K. W. (2019b, 14 de febrero). Building with patterns: The computed pattern. </w:t>
+        <w:t xml:space="preserve">Coupal, D. y Alger, K. W. (2019a, 14 de febrero). Building with patterns: The computed pattern. </w:t>
       </w:r>
       <w:r>
         <w:rPr>
@@ -8620,7 +8593,7 @@
           <w:b w:val="0"/>
           <w:i w:val="0"/>
         </w:rPr>
-        <w:t xml:space="preserve">Coupal, D. y Alger, K. W. (2019c, 28 de febrero). Building with patterns: The subset pattern. </w:t>
+        <w:t xml:space="preserve">Coupal, D. y Alger, K. W. (2019b, 28 de febrero). Building with patterns: The subset pattern. </w:t>
       </w:r>
       <w:r>
         <w:rPr>
@@ -8647,7 +8620,7 @@
           <w:b w:val="0"/>
           <w:i w:val="0"/>
         </w:rPr>
-        <w:t xml:space="preserve">Coupal, D. y Alger, K. W. (2019d, 7 de marzo). Building with patterns: The extended reference pattern. </w:t>
+        <w:t xml:space="preserve">Coupal, D. y Alger, K. W. (2019c, 7 de marzo). Building with patterns: The extended reference pattern. </w:t>
       </w:r>
       <w:r>
         <w:rPr>
@@ -8674,7 +8647,7 @@
           <w:b w:val="0"/>
           <w:i w:val="0"/>
         </w:rPr>
-        <w:t xml:space="preserve">Coupal, D. y Alger, K. W. (2019e, 26 de abril). Building with patterns: A summary. </w:t>
+        <w:t xml:space="preserve">Coupal, D. y Alger, K. W. (2019d, 26 de abril). Building with patterns: A summary. </w:t>
       </w:r>
       <w:r>
         <w:rPr>
@@ -8789,6 +8762,33 @@
           <w:b w:val="0"/>
           <w:i/>
         </w:rPr>
+        <w:t>Group data with the bucket pattern</w:t>
+      </w:r>
+      <w:r>
+        <w:rPr>
+          <w:b w:val="0"/>
+          <w:i w:val="0"/>
+        </w:rPr>
+        <w:t>. MongoDB Database Manual. Recuperado el 1 de noviembre de 2026, de https://www.mongodb.com/docs/manual/data-modeling/design-patterns/group-data/bucket-pattern/</w:t>
+      </w:r>
+    </w:p>
+    <w:p>
+      <w:pPr>
+        <w:spacing w:after="120"/>
+        <w:ind w:left="720" w:hanging="720"/>
+      </w:pPr>
+      <w:r>
+        <w:rPr>
+          <w:b w:val="0"/>
+          <w:i w:val="0"/>
+        </w:rPr>
+        <w:t xml:space="preserve">MongoDB, Inc. (s. f.-d). </w:t>
+      </w:r>
+      <w:r>
+        <w:rPr>
+          <w:b w:val="0"/>
+          <w:i/>
+        </w:rPr>
         <w:t>Model monetary data</w:t>
       </w:r>
       <w:r>
@@ -8809,7 +8809,7 @@
           <w:b w:val="0"/>
           <w:i w:val="0"/>
         </w:rPr>
-        <w:t xml:space="preserve">MongoDB, Inc. (s. f.-d). </w:t>
+        <w:t xml:space="preserve">MongoDB, Inc. (s. f.-e). </w:t>
       </w:r>
       <w:r>
         <w:rPr>
@@ -8836,7 +8836,7 @@
           <w:b w:val="0"/>
           <w:i w:val="0"/>
         </w:rPr>
-        <w:t xml:space="preserve">MongoDB, Inc. (s. f.-e). </w:t>
+        <w:t xml:space="preserve">MongoDB, Inc. (s. f.-f). </w:t>
       </w:r>
       <w:r>
         <w:rPr>
@@ -8863,7 +8863,7 @@
           <w:b w:val="0"/>
           <w:i w:val="0"/>
         </w:rPr>
-        <w:t xml:space="preserve">MongoDB, Inc. (s. f.-f). </w:t>
+        <w:t xml:space="preserve">MongoDB, Inc. (s. f.-g). </w:t>
       </w:r>
       <w:r>
         <w:rPr>
@@ -8890,7 +8890,7 @@
           <w:b w:val="0"/>
           <w:i w:val="0"/>
         </w:rPr>
-        <w:t xml:space="preserve">MongoDB, Inc. (s. f.-g). </w:t>
+        <w:t xml:space="preserve">MongoDB, Inc. (s. f.-h). </w:t>
       </w:r>
       <w:r>
         <w:rPr>

</xml_diff>